<commit_message>
V3: Version ya arreglada, despues del fallo
</commit_message>
<xml_diff>
--- a/ProyectoFinal/REGISTRO DE CONFIGURACION TRABAJO FINAL DE ENTORNOS.docx
+++ b/ProyectoFinal/REGISTRO DE CONFIGURACION TRABAJO FINAL DE ENTORNOS.docx
@@ -937,24 +937,1046 @@
         <w:t xml:space="preserve"> ahora</w:t>
       </w:r>
     </w:p>
-    <w:p/>
-    <w:p/>
-    <w:p/>
-    <w:p/>
-    <w:p/>
-    <w:p>
-      <w:r>
-        <w:t xml:space="preserve">Cursor: </w:t>
-      </w:r>
-    </w:p>
-    <w:p>
-      <w:pPr>
-        <w:rPr>
-          <w:u w:val="single"/>
-        </w:rPr>
-      </w:pPr>
-      <w:r>
-        <w:t xml:space="preserve">Para cursor he descargado, Claude </w:t>
+    <w:p>
+      <w:r>
+        <w:lastRenderedPageBreak/>
+        <w:drawing>
+          <wp:anchor distT="0" distB="0" distL="114300" distR="114300" simplePos="0" relativeHeight="251660288" behindDoc="0" locked="0" layoutInCell="1" allowOverlap="1" wp14:anchorId="1D0EC4F5" wp14:editId="5AA6B149">
+            <wp:simplePos x="0" y="0"/>
+            <wp:positionH relativeFrom="margin">
+              <wp:align>center</wp:align>
+            </wp:positionH>
+            <wp:positionV relativeFrom="paragraph">
+              <wp:posOffset>67</wp:posOffset>
+            </wp:positionV>
+            <wp:extent cx="3787775" cy="2057400"/>
+            <wp:effectExtent l="0" t="0" r="3175" b="0"/>
+            <wp:wrapSquare wrapText="bothSides"/>
+            <wp:docPr id="3" name="Imagen 3"/>
+            <wp:cNvGraphicFramePr>
+              <a:graphicFrameLocks xmlns:a="http://schemas.openxmlformats.org/drawingml/2006/main" noChangeAspect="1"/>
+            </wp:cNvGraphicFramePr>
+            <a:graphic xmlns:a="http://schemas.openxmlformats.org/drawingml/2006/main">
+              <a:graphicData uri="http://schemas.openxmlformats.org/drawingml/2006/picture">
+                <pic:pic xmlns:pic="http://schemas.openxmlformats.org/drawingml/2006/picture">
+                  <pic:nvPicPr>
+                    <pic:cNvPr id="1" name=""/>
+                    <pic:cNvPicPr/>
+                  </pic:nvPicPr>
+                  <pic:blipFill>
+                    <a:blip r:embed="rId8" cstate="print">
+                      <a:extLst>
+                        <a:ext uri="{28A0092B-C50C-407E-A947-70E740481C1C}">
+                          <a14:useLocalDpi xmlns:a14="http://schemas.microsoft.com/office/drawing/2010/main" val="0"/>
+                        </a:ext>
+                      </a:extLst>
+                    </a:blip>
+                    <a:stretch>
+                      <a:fillRect/>
+                    </a:stretch>
+                  </pic:blipFill>
+                  <pic:spPr>
+                    <a:xfrm>
+                      <a:off x="0" y="0"/>
+                      <a:ext cx="3787775" cy="2057400"/>
+                    </a:xfrm>
+                    <a:prstGeom prst="rect">
+                      <a:avLst/>
+                    </a:prstGeom>
+                  </pic:spPr>
+                </pic:pic>
+              </a:graphicData>
+            </a:graphic>
+            <wp14:sizeRelH relativeFrom="margin">
+              <wp14:pctWidth>0</wp14:pctWidth>
+            </wp14:sizeRelH>
+            <wp14:sizeRelV relativeFrom="margin">
+              <wp14:pctHeight>0</wp14:pctHeight>
+            </wp14:sizeRelV>
+          </wp:anchor>
+        </w:drawing>
+      </w:r>
+    </w:p>
+    <w:p/>
+    <w:p/>
+    <w:p/>
+    <w:p/>
+    <w:p/>
+    <w:p/>
+    <w:p/>
+    <w:p>
+      <w:r>
+        <w:rPr>
+          <w:b/>
+        </w:rPr>
+        <w:t>Esto es lo que me ha respondido el agente</w:t>
+      </w:r>
+      <w:r>
+        <w:t xml:space="preserve">: </w:t>
+      </w:r>
+      <w:r>
+        <w:t>He generado desde cero el script en Node.js y el archivo CSV de prueba con los requisitos solicitados.</w:t>
+      </w:r>
+    </w:p>
+    <w:p/>
+    <w:p>
+      <w:r>
+        <w:t>Aquí tienes un desglose de los archivos creados en tu espacio de trabajo:</w:t>
+      </w:r>
+    </w:p>
+    <w:p/>
+    <w:p>
+      <w:r>
+        <w:t>1. Script Node.js (validador_socios.js)</w:t>
+      </w:r>
+    </w:p>
+    <w:p>
+      <w:r>
+        <w:t xml:space="preserve">He implementado el script utilizando exclusivamente los módulos nativos </w:t>
+      </w:r>
+      <w:proofErr w:type="spellStart"/>
+      <w:r>
+        <w:t>fs</w:t>
+      </w:r>
+      <w:proofErr w:type="spellEnd"/>
+      <w:r>
+        <w:t xml:space="preserve"> y </w:t>
+      </w:r>
+      <w:proofErr w:type="spellStart"/>
+      <w:r>
+        <w:t>path</w:t>
+      </w:r>
+      <w:proofErr w:type="spellEnd"/>
+      <w:r>
+        <w:t>.</w:t>
+      </w:r>
+    </w:p>
+    <w:p/>
+    <w:p>
+      <w:r>
+        <w:t>Características principales:</w:t>
+      </w:r>
+    </w:p>
+    <w:p/>
+    <w:p>
+      <w:r>
+        <w:t>Expresión Regular Robusta: Utiliza la expresión regular /^[^\s@]+@[a-zA-Z0-9-]+(?:</w:t>
+      </w:r>
+      <w:proofErr w:type="gramStart"/>
+      <w:r>
+        <w:t>\.[</w:t>
+      </w:r>
+      <w:proofErr w:type="gramEnd"/>
+      <w:r>
+        <w:t>a-zA-Z0-9-]+)*\.[a-</w:t>
+      </w:r>
+      <w:proofErr w:type="spellStart"/>
+      <w:r>
+        <w:t>zA</w:t>
+      </w:r>
+      <w:proofErr w:type="spellEnd"/>
+      <w:r>
+        <w:t>-Z]{2,6}$/, la cual garantiza que:</w:t>
+      </w:r>
+    </w:p>
+    <w:p>
+      <w:r>
+        <w:t>Exista un usuario, un símbolo @ y un dominio.</w:t>
+      </w:r>
+    </w:p>
+    <w:p>
+      <w:r>
+        <w:t>No existan espacios en ninguna parte.</w:t>
+      </w:r>
+    </w:p>
+    <w:p>
+      <w:r>
+        <w:t>El dominio soporte posibles subdominios, validando al menos un punto intermedio antes de la extensión.</w:t>
+      </w:r>
+    </w:p>
+    <w:p>
+      <w:r>
+        <w:t>La extensión final consista en caracteres alfabéticos y tenga correctamente una longitud de entre 2 y 6 letras.</w:t>
+      </w:r>
+    </w:p>
+    <w:p>
+      <w:r>
+        <w:t>Manejo de Errores Riguroso (try/catch): Valida si el archivo original existe. En caso contrario, se arroja un error explicativo a la terminal. También comprueba que existan datos e intuye dinámicamente la posición de la columna llamada "email".</w:t>
+      </w:r>
+    </w:p>
+    <w:p>
+      <w:r>
+        <w:t>Salida de los Resultados: Divide las filas de datos válidas e inválidas conservando en los nuevos listados sus cabeceras originales, exportándolas como a emails_validos.csv y emails_invalidos.csv.</w:t>
+      </w:r>
+    </w:p>
+    <w:p>
+      <w:r>
+        <w:t>2. Archivo de Prueba (socios.csv)</w:t>
+      </w:r>
+    </w:p>
+    <w:p>
+      <w:r>
+        <w:lastRenderedPageBreak/>
+        <w:t>He creado el fichero de demostración con 10 escenarios intencionadamente diversos para probar a fondo el validador, cubriendo tanto casos válidos como correos con errores comunes:</w:t>
+      </w:r>
+    </w:p>
+    <w:p/>
+    <w:p>
+      <w:r>
+        <w:t>juan.perez@ateneo.org (Válido)</w:t>
+      </w:r>
+    </w:p>
+    <w:p>
+      <w:r>
+        <w:t>ana_garcia.com (Inválido: Sin @)</w:t>
+      </w:r>
+    </w:p>
+    <w:p>
+      <w:r>
+        <w:t>pedro@.</w:t>
+      </w:r>
+      <w:proofErr w:type="spellStart"/>
+      <w:r>
+        <w:t>com</w:t>
+      </w:r>
+      <w:proofErr w:type="spellEnd"/>
+      <w:r>
+        <w:t xml:space="preserve"> (Inválido: Dominio vacío)</w:t>
+      </w:r>
+    </w:p>
+    <w:p>
+      <w:r>
+        <w:t>maria.l@domain.co (Válido)</w:t>
+      </w:r>
+    </w:p>
+    <w:p>
+      <w:proofErr w:type="spellStart"/>
+      <w:r>
+        <w:t>luis</w:t>
+      </w:r>
+      <w:proofErr w:type="spellEnd"/>
+      <w:r>
+        <w:t xml:space="preserve"> @espacio.com (Inválido: Espacio en el usuario)</w:t>
+      </w:r>
+    </w:p>
+    <w:p>
+      <w:proofErr w:type="spellStart"/>
+      <w:r>
+        <w:t>elena@domain.toolongext</w:t>
+      </w:r>
+      <w:proofErr w:type="spellEnd"/>
+      <w:r>
+        <w:t xml:space="preserve"> (Inválido: Extensión superior a 6 caracteres)</w:t>
+      </w:r>
+    </w:p>
+    <w:p>
+      <w:r>
+        <w:t>carlos_s77@sub.dominio.es (Válido - Soporta subdominios)</w:t>
+      </w:r>
+    </w:p>
+    <w:p>
+      <w:proofErr w:type="spellStart"/>
+      <w:r>
+        <w:t>laura@dominio.c</w:t>
+      </w:r>
+      <w:proofErr w:type="spellEnd"/>
+      <w:r>
+        <w:t xml:space="preserve"> (Inválido: Extensión inferior a 2 caracteres)</w:t>
+      </w:r>
+    </w:p>
+    <w:p>
+      <w:proofErr w:type="spellStart"/>
+      <w:r>
+        <w:t>sofia@dominio</w:t>
+      </w:r>
+      <w:proofErr w:type="spellEnd"/>
+      <w:r>
+        <w:t xml:space="preserve"> (Inválido: Sin extensión/No lleva punto)</w:t>
+      </w:r>
+    </w:p>
+    <w:p>
+      <w:r>
+        <w:t>diego123@ateneo.edu (Válido)</w:t>
+      </w:r>
+    </w:p>
+    <w:p>
+      <w:r>
+        <w:t>Resultado de la Ejecución</w:t>
+      </w:r>
+    </w:p>
+    <w:p>
+      <w:r>
+        <w:t>He ejecutado el script en tu terminal. El resultado fue el siguiente resumen por consola:</w:t>
+      </w:r>
+    </w:p>
+    <w:p/>
+    <w:p>
+      <w:proofErr w:type="spellStart"/>
+      <w:r>
+        <w:t>text</w:t>
+      </w:r>
+      <w:proofErr w:type="spellEnd"/>
+    </w:p>
+    <w:p>
+      <w:r>
+        <w:t>Iniciando el proceso de validación de correos...</w:t>
+      </w:r>
+    </w:p>
+    <w:p>
+      <w:r>
+        <w:t>--- Resumen de Validación de Correos ---</w:t>
+      </w:r>
+    </w:p>
+    <w:p>
+      <w:r>
+        <w:rPr>
+          <w:rFonts w:ascii="Segoe UI Symbol" w:hAnsi="Segoe UI Symbol" w:cs="Segoe UI Symbol"/>
+        </w:rPr>
+        <w:t>📑</w:t>
+      </w:r>
+      <w:r>
+        <w:t xml:space="preserve"> Total de registros leídos: 10</w:t>
+      </w:r>
+    </w:p>
+    <w:p>
+      <w:r>
+        <w:rPr>
+          <w:rFonts w:ascii="Segoe UI Symbol" w:hAnsi="Segoe UI Symbol" w:cs="Segoe UI Symbol"/>
+        </w:rPr>
+        <w:t>✅</w:t>
+      </w:r>
+      <w:r>
+        <w:t xml:space="preserve"> Correos Válidos:    4 (Exportados a emails_validos.csv)</w:t>
+      </w:r>
+    </w:p>
+    <w:p>
+      <w:r>
+        <w:rPr>
+          <w:rFonts w:ascii="Segoe UI Symbol" w:hAnsi="Segoe UI Symbol" w:cs="Segoe UI Symbol"/>
+        </w:rPr>
+        <w:t>❌</w:t>
+      </w:r>
+      <w:r>
+        <w:t xml:space="preserve"> Correos Inválidos:  6 (Exportados a emails_invalidos.csv)</w:t>
+      </w:r>
+    </w:p>
+    <w:p>
+      <w:r>
+        <w:t>----------------------------------------</w:t>
+      </w:r>
+    </w:p>
+    <w:p>
+      <w:r>
+        <w:t>Si revisas tu carpeta, observarás que los dos archivos CSV de salida ya han sido creados correctamente. ¡Avísame si necesitas modificar o ampliar la lógica u opciones de tu script!</w:t>
+      </w:r>
+    </w:p>
+    <w:p>
+      <w:r>
+        <w:lastRenderedPageBreak/>
+        <w:drawing>
+          <wp:inline distT="0" distB="0" distL="0" distR="0" wp14:anchorId="7913919B" wp14:editId="2D17500E">
+            <wp:extent cx="5400040" cy="2884170"/>
+            <wp:effectExtent l="0" t="0" r="0" b="0"/>
+            <wp:docPr id="4" name="Imagen 4"/>
+            <wp:cNvGraphicFramePr>
+              <a:graphicFrameLocks xmlns:a="http://schemas.openxmlformats.org/drawingml/2006/main" noChangeAspect="1"/>
+            </wp:cNvGraphicFramePr>
+            <a:graphic xmlns:a="http://schemas.openxmlformats.org/drawingml/2006/main">
+              <a:graphicData uri="http://schemas.openxmlformats.org/drawingml/2006/picture">
+                <pic:pic xmlns:pic="http://schemas.openxmlformats.org/drawingml/2006/picture">
+                  <pic:nvPicPr>
+                    <pic:cNvPr id="1" name=""/>
+                    <pic:cNvPicPr/>
+                  </pic:nvPicPr>
+                  <pic:blipFill>
+                    <a:blip r:embed="rId9"/>
+                    <a:stretch>
+                      <a:fillRect/>
+                    </a:stretch>
+                  </pic:blipFill>
+                  <pic:spPr>
+                    <a:xfrm>
+                      <a:off x="0" y="0"/>
+                      <a:ext cx="5400040" cy="2884170"/>
+                    </a:xfrm>
+                    <a:prstGeom prst="rect">
+                      <a:avLst/>
+                    </a:prstGeom>
+                  </pic:spPr>
+                </pic:pic>
+              </a:graphicData>
+            </a:graphic>
+          </wp:inline>
+        </w:drawing>
+      </w:r>
+    </w:p>
+    <w:p>
+      <w:r>
+        <w:t xml:space="preserve">Y este es el </w:t>
+      </w:r>
+      <w:proofErr w:type="spellStart"/>
+      <w:r>
+        <w:t>html</w:t>
+      </w:r>
+      <w:proofErr w:type="spellEnd"/>
+      <w:r>
+        <w:t xml:space="preserve"> que me ha generado para esta </w:t>
+      </w:r>
+      <w:r>
+        <w:t>aplicación</w:t>
+      </w:r>
+    </w:p>
+    <w:p>
+      <w:r>
+        <w:t>Esto es lo que me ha respondido cuando le he pedido que implemente el index.html que ya existía a este proyecto</w:t>
+      </w:r>
+    </w:p>
+    <w:p/>
+    <w:p>
+      <w:r>
+        <w:t xml:space="preserve">Como habías insertado directamente el script original en el HTML (&lt;script </w:t>
+      </w:r>
+      <w:proofErr w:type="spellStart"/>
+      <w:r>
+        <w:t>src</w:t>
+      </w:r>
+      <w:proofErr w:type="spellEnd"/>
+      <w:r>
+        <w:t>="validador_socios.js"&gt;&lt;/script&gt;), quiero aclarar un pequeño detalle técnico: </w:t>
+      </w:r>
+      <w:r>
+        <w:rPr>
+          <w:b/>
+          <w:bCs/>
+        </w:rPr>
+        <w:t>los navegadores web no pueden ejecutar módulos nativos de Node.js como </w:t>
+      </w:r>
+      <w:proofErr w:type="spellStart"/>
+      <w:r>
+        <w:rPr>
+          <w:b/>
+          <w:bCs/>
+        </w:rPr>
+        <w:t>fs</w:t>
+      </w:r>
+      <w:proofErr w:type="spellEnd"/>
+      <w:r>
+        <w:rPr>
+          <w:b/>
+          <w:bCs/>
+        </w:rPr>
+        <w:t> o </w:t>
+      </w:r>
+      <w:proofErr w:type="spellStart"/>
+      <w:r>
+        <w:rPr>
+          <w:b/>
+          <w:bCs/>
+        </w:rPr>
+        <w:t>path</w:t>
+      </w:r>
+      <w:proofErr w:type="spellEnd"/>
+      <w:r>
+        <w:t> porque por seguridad no tienen acceso directo de lectura y escritura al disco duro local del usuario.</w:t>
+      </w:r>
+    </w:p>
+    <w:p>
+      <w:r>
+        <w:t>Para que puedas usar esta aplicación </w:t>
+      </w:r>
+      <w:r>
+        <w:rPr>
+          <w:b/>
+          <w:bCs/>
+        </w:rPr>
+        <w:t>directamente desde el navegador</w:t>
+      </w:r>
+      <w:r>
+        <w:t>, la he transformado en una </w:t>
+      </w:r>
+      <w:r>
+        <w:rPr>
+          <w:b/>
+          <w:bCs/>
+        </w:rPr>
+        <w:t>Aplicación Web Completa (</w:t>
+      </w:r>
+      <w:proofErr w:type="spellStart"/>
+      <w:r>
+        <w:rPr>
+          <w:b/>
+          <w:bCs/>
+        </w:rPr>
+        <w:t>Frontend</w:t>
+      </w:r>
+      <w:proofErr w:type="spellEnd"/>
+      <w:r>
+        <w:rPr>
+          <w:b/>
+          <w:bCs/>
+        </w:rPr>
+        <w:t>)</w:t>
+      </w:r>
+      <w:r>
+        <w:t> sumamente visual, elegante e intuitiva donde puedes arrastrar tu archivo y gestionarlo.</w:t>
+      </w:r>
+    </w:p>
+    <w:p>
+      <w:r>
+        <w:t>He creado/modificado </w:t>
+      </w:r>
+      <w:r>
+        <w:rPr>
+          <w:b/>
+          <w:bCs/>
+        </w:rPr>
+        <w:t>3 archivos</w:t>
+      </w:r>
+      <w:r>
+        <w:t> en tu directorio:</w:t>
+      </w:r>
+    </w:p>
+    <w:p>
+      <w:r>
+        <w:t>1. index.html (Tu estructura)</w:t>
+      </w:r>
+    </w:p>
+    <w:p>
+      <w:r>
+        <w:t>He borrado el HTML básico y he construido una estructura con una interfaz "</w:t>
+      </w:r>
+      <w:proofErr w:type="spellStart"/>
+      <w:r>
+        <w:t>Glassmorphism</w:t>
+      </w:r>
+      <w:proofErr w:type="spellEnd"/>
+      <w:r>
+        <w:t>".</w:t>
+      </w:r>
+    </w:p>
+    <w:p>
+      <w:pPr>
+        <w:numPr>
+          <w:ilvl w:val="0"/>
+          <w:numId w:val="2"/>
+        </w:numPr>
+      </w:pPr>
+      <w:r>
+        <w:t>Tiene una zona para </w:t>
+      </w:r>
+      <w:r>
+        <w:rPr>
+          <w:b/>
+          <w:bCs/>
+        </w:rPr>
+        <w:t>arrastrar y soltar</w:t>
+      </w:r>
+      <w:r>
+        <w:t> el archivo CSV o seleccionarlo haciendo clic de modo tradicional.</w:t>
+      </w:r>
+    </w:p>
+    <w:p>
+      <w:pPr>
+        <w:numPr>
+          <w:ilvl w:val="0"/>
+          <w:numId w:val="2"/>
+        </w:numPr>
+      </w:pPr>
+      <w:r>
+        <w:t>Implementa paneles elegantes para mostrarte la métrica de análisis visualmente, eliminando el antiguo validador_socios.js e integrando el nuevo app.js.</w:t>
+      </w:r>
+    </w:p>
+    <w:p>
+      <w:r>
+        <w:t>2. styles.css (El Diseño Moderno)</w:t>
+      </w:r>
+    </w:p>
+    <w:p>
+      <w:r>
+        <w:t>La aplicación cuenta ahora con un diseño muy "Premium", lo que incluye:</w:t>
+      </w:r>
+    </w:p>
+    <w:p>
+      <w:pPr>
+        <w:numPr>
+          <w:ilvl w:val="0"/>
+          <w:numId w:val="3"/>
+        </w:numPr>
+      </w:pPr>
+      <w:r>
+        <w:t>Modo oscuro con un degradado sutil al fondo (#0f172a a #1e1b4b).</w:t>
+      </w:r>
+    </w:p>
+    <w:p>
+      <w:pPr>
+        <w:numPr>
+          <w:ilvl w:val="0"/>
+          <w:numId w:val="3"/>
+        </w:numPr>
+      </w:pPr>
+      <w:r>
+        <w:t>Elementos translúcidos con desenfoque de fondo ("</w:t>
+      </w:r>
+      <w:proofErr w:type="spellStart"/>
+      <w:r>
+        <w:t>Glassmorphism</w:t>
+      </w:r>
+      <w:proofErr w:type="spellEnd"/>
+      <w:r>
+        <w:t>").</w:t>
+      </w:r>
+    </w:p>
+    <w:p>
+      <w:pPr>
+        <w:numPr>
+          <w:ilvl w:val="0"/>
+          <w:numId w:val="3"/>
+        </w:numPr>
+      </w:pPr>
+      <w:r>
+        <w:t xml:space="preserve">Distintos colores semánticos, además de animaciones sutiles interactivas y tipografía moderna exportada desde Google </w:t>
+      </w:r>
+      <w:proofErr w:type="spellStart"/>
+      <w:r>
+        <w:t>Fonts</w:t>
+      </w:r>
+      <w:proofErr w:type="spellEnd"/>
+      <w:r>
+        <w:t>.</w:t>
+      </w:r>
+    </w:p>
+    <w:p>
+      <w:r>
+        <w:lastRenderedPageBreak/>
+        <w:t>3. app.js (La Lógica Adaptada)</w:t>
+      </w:r>
+    </w:p>
+    <w:p>
+      <w:r>
+        <w:t>He tomado tu bloque lógico principal y la </w:t>
+      </w:r>
+      <w:r>
+        <w:rPr>
+          <w:b/>
+          <w:bCs/>
+        </w:rPr>
+        <w:t xml:space="preserve">expresión regular </w:t>
+      </w:r>
+      <w:proofErr w:type="gramStart"/>
+      <w:r>
+        <w:rPr>
+          <w:b/>
+          <w:bCs/>
+        </w:rPr>
+        <w:t>idéntica</w:t>
+      </w:r>
+      <w:proofErr w:type="gramEnd"/>
+      <w:r>
+        <w:t> pero haciéndola compatible al 100% con los navegadores:</w:t>
+      </w:r>
+    </w:p>
+    <w:p>
+      <w:pPr>
+        <w:numPr>
+          <w:ilvl w:val="0"/>
+          <w:numId w:val="4"/>
+        </w:numPr>
+      </w:pPr>
+      <w:r>
+        <w:t>Sustituye </w:t>
+      </w:r>
+      <w:proofErr w:type="spellStart"/>
+      <w:proofErr w:type="gramStart"/>
+      <w:r>
+        <w:t>fs.readFileSync</w:t>
+      </w:r>
+      <w:proofErr w:type="spellEnd"/>
+      <w:proofErr w:type="gramEnd"/>
+      <w:r>
+        <w:t> por </w:t>
+      </w:r>
+      <w:proofErr w:type="spellStart"/>
+      <w:r>
+        <w:rPr>
+          <w:b/>
+          <w:bCs/>
+        </w:rPr>
+        <w:t>FileReader</w:t>
+      </w:r>
+      <w:proofErr w:type="spellEnd"/>
+      <w:r>
+        <w:t xml:space="preserve">, una API de </w:t>
+      </w:r>
+      <w:proofErr w:type="spellStart"/>
+      <w:r>
+        <w:t>Javascript</w:t>
+      </w:r>
+      <w:proofErr w:type="spellEnd"/>
+      <w:r>
+        <w:t xml:space="preserve"> nativa que puede leer documentos que el usuario inserta en la web.</w:t>
+      </w:r>
+    </w:p>
+    <w:p>
+      <w:pPr>
+        <w:numPr>
+          <w:ilvl w:val="0"/>
+          <w:numId w:val="4"/>
+        </w:numPr>
+      </w:pPr>
+      <w:r>
+        <w:t>Sustituye </w:t>
+      </w:r>
+      <w:proofErr w:type="spellStart"/>
+      <w:proofErr w:type="gramStart"/>
+      <w:r>
+        <w:t>fs.writeFileSync</w:t>
+      </w:r>
+      <w:proofErr w:type="spellEnd"/>
+      <w:proofErr w:type="gramEnd"/>
+      <w:r>
+        <w:t> por </w:t>
+      </w:r>
+      <w:r>
+        <w:rPr>
+          <w:b/>
+          <w:bCs/>
+        </w:rPr>
+        <w:t>Blob</w:t>
+      </w:r>
+      <w:r>
+        <w:t xml:space="preserve">. En vez de guardarlos directamente silenciados en el disco duro (que un navegador no puede hacer), fabricamos un archivo temporal en la memoria y generamos un link de descargar de esos </w:t>
+      </w:r>
+      <w:proofErr w:type="spellStart"/>
+      <w:r>
+        <w:t>CSVs</w:t>
+      </w:r>
+      <w:proofErr w:type="spellEnd"/>
+      <w:r>
+        <w:t xml:space="preserve"> válidos e inválidos que aparecen por abajo con unos botones listos para hacer clic.</w:t>
+      </w:r>
+    </w:p>
+    <w:p>
+      <w:r>
+        <w:t>Cómo usarlo ahora:</w:t>
+      </w:r>
+    </w:p>
+    <w:p>
+      <w:pPr>
+        <w:numPr>
+          <w:ilvl w:val="0"/>
+          <w:numId w:val="5"/>
+        </w:numPr>
+      </w:pPr>
+      <w:r>
+        <w:t>Simplemente haz </w:t>
+      </w:r>
+      <w:r>
+        <w:rPr>
+          <w:b/>
+          <w:bCs/>
+        </w:rPr>
+        <w:t>doble clic en el nuevo index.html</w:t>
+      </w:r>
+      <w:r>
+        <w:t xml:space="preserve"> para abrirlo en tu navegador normal (Google Chrome, Firefox o </w:t>
+      </w:r>
+      <w:proofErr w:type="spellStart"/>
+      <w:r>
+        <w:t>Edge</w:t>
+      </w:r>
+      <w:proofErr w:type="spellEnd"/>
+      <w:r>
+        <w:t>).</w:t>
+      </w:r>
+    </w:p>
+    <w:p>
+      <w:pPr>
+        <w:numPr>
+          <w:ilvl w:val="0"/>
+          <w:numId w:val="5"/>
+        </w:numPr>
+      </w:pPr>
+      <w:r>
+        <w:t>Arrastra encima de la caja tu archivo del mismo directorio (socios.csv).</w:t>
+      </w:r>
+    </w:p>
+    <w:p>
+      <w:pPr>
+        <w:numPr>
+          <w:ilvl w:val="0"/>
+          <w:numId w:val="5"/>
+        </w:numPr>
+      </w:pPr>
+      <w:r>
+        <w:t>Verás una animación chula contando los correos y finalmente... los links para descartar tus correos procesados. ¡Todo sucede en menos de 1 segundo sin necesidad de terminal!</w:t>
+      </w:r>
+    </w:p>
+    <w:p/>
+    <w:p/>
+    <w:p>
+      <w:r>
+        <w:drawing>
+          <wp:anchor distT="0" distB="0" distL="114300" distR="114300" simplePos="0" relativeHeight="251661312" behindDoc="0" locked="0" layoutInCell="1" allowOverlap="1" wp14:anchorId="16E1751D" wp14:editId="62569A0C">
+            <wp:simplePos x="0" y="0"/>
+            <wp:positionH relativeFrom="column">
+              <wp:posOffset>-89535</wp:posOffset>
+            </wp:positionH>
+            <wp:positionV relativeFrom="paragraph">
+              <wp:posOffset>362005</wp:posOffset>
+            </wp:positionV>
+            <wp:extent cx="4800600" cy="3733110"/>
+            <wp:effectExtent l="0" t="0" r="0" b="1270"/>
+            <wp:wrapTopAndBottom/>
+            <wp:docPr id="5" name="Imagen 5"/>
+            <wp:cNvGraphicFramePr>
+              <a:graphicFrameLocks xmlns:a="http://schemas.openxmlformats.org/drawingml/2006/main" noChangeAspect="1"/>
+            </wp:cNvGraphicFramePr>
+            <a:graphic xmlns:a="http://schemas.openxmlformats.org/drawingml/2006/main">
+              <a:graphicData uri="http://schemas.openxmlformats.org/drawingml/2006/picture">
+                <pic:pic xmlns:pic="http://schemas.openxmlformats.org/drawingml/2006/picture">
+                  <pic:nvPicPr>
+                    <pic:cNvPr id="1" name=""/>
+                    <pic:cNvPicPr/>
+                  </pic:nvPicPr>
+                  <pic:blipFill>
+                    <a:blip r:embed="rId10" cstate="print">
+                      <a:extLst>
+                        <a:ext uri="{28A0092B-C50C-407E-A947-70E740481C1C}">
+                          <a14:useLocalDpi xmlns:a14="http://schemas.microsoft.com/office/drawing/2010/main" val="0"/>
+                        </a:ext>
+                      </a:extLst>
+                    </a:blip>
+                    <a:stretch>
+                      <a:fillRect/>
+                    </a:stretch>
+                  </pic:blipFill>
+                  <pic:spPr>
+                    <a:xfrm>
+                      <a:off x="0" y="0"/>
+                      <a:ext cx="4801327" cy="3733675"/>
+                    </a:xfrm>
+                    <a:prstGeom prst="rect">
+                      <a:avLst/>
+                    </a:prstGeom>
+                  </pic:spPr>
+                </pic:pic>
+              </a:graphicData>
+            </a:graphic>
+            <wp14:sizeRelH relativeFrom="margin">
+              <wp14:pctWidth>0</wp14:pctWidth>
+            </wp14:sizeRelH>
+            <wp14:sizeRelV relativeFrom="margin">
+              <wp14:pctHeight>0</wp14:pctHeight>
+            </wp14:sizeRelV>
+          </wp:anchor>
+        </w:drawing>
+      </w:r>
+      <w:r>
+        <w:t xml:space="preserve">Este es el resultado de esta Fase para </w:t>
+      </w:r>
+      <w:proofErr w:type="spellStart"/>
+      <w:r>
+        <w:t>antigravity</w:t>
+      </w:r>
+      <w:proofErr w:type="spellEnd"/>
+      <w:r>
+        <w:t>:</w:t>
+      </w:r>
+    </w:p>
+    <w:p/>
+    <w:p/>
+    <w:p>
+      <w:r>
+        <w:lastRenderedPageBreak/>
+        <w:drawing>
+          <wp:anchor distT="0" distB="0" distL="114300" distR="114300" simplePos="0" relativeHeight="251662336" behindDoc="0" locked="0" layoutInCell="1" allowOverlap="1">
+            <wp:simplePos x="0" y="0"/>
+            <wp:positionH relativeFrom="margin">
+              <wp:align>left</wp:align>
+            </wp:positionH>
+            <wp:positionV relativeFrom="paragraph">
+              <wp:posOffset>3810</wp:posOffset>
+            </wp:positionV>
+            <wp:extent cx="3827145" cy="3441700"/>
+            <wp:effectExtent l="0" t="0" r="1905" b="6350"/>
+            <wp:wrapSquare wrapText="bothSides"/>
+            <wp:docPr id="6" name="Imagen 6"/>
+            <wp:cNvGraphicFramePr>
+              <a:graphicFrameLocks xmlns:a="http://schemas.openxmlformats.org/drawingml/2006/main" noChangeAspect="1"/>
+            </wp:cNvGraphicFramePr>
+            <a:graphic xmlns:a="http://schemas.openxmlformats.org/drawingml/2006/main">
+              <a:graphicData uri="http://schemas.openxmlformats.org/drawingml/2006/picture">
+                <pic:pic xmlns:pic="http://schemas.openxmlformats.org/drawingml/2006/picture">
+                  <pic:nvPicPr>
+                    <pic:cNvPr id="1" name=""/>
+                    <pic:cNvPicPr/>
+                  </pic:nvPicPr>
+                  <pic:blipFill>
+                    <a:blip r:embed="rId11">
+                      <a:extLst>
+                        <a:ext uri="{28A0092B-C50C-407E-A947-70E740481C1C}">
+                          <a14:useLocalDpi xmlns:a14="http://schemas.microsoft.com/office/drawing/2010/main" val="0"/>
+                        </a:ext>
+                      </a:extLst>
+                    </a:blip>
+                    <a:stretch>
+                      <a:fillRect/>
+                    </a:stretch>
+                  </pic:blipFill>
+                  <pic:spPr>
+                    <a:xfrm>
+                      <a:off x="0" y="0"/>
+                      <a:ext cx="3827145" cy="3441700"/>
+                    </a:xfrm>
+                    <a:prstGeom prst="rect">
+                      <a:avLst/>
+                    </a:prstGeom>
+                  </pic:spPr>
+                </pic:pic>
+              </a:graphicData>
+            </a:graphic>
+            <wp14:sizeRelH relativeFrom="margin">
+              <wp14:pctWidth>0</wp14:pctWidth>
+            </wp14:sizeRelH>
+            <wp14:sizeRelV relativeFrom="margin">
+              <wp14:pctHeight>0</wp14:pctHeight>
+            </wp14:sizeRelV>
+          </wp:anchor>
+        </w:drawing>
+      </w:r>
+    </w:p>
+    <w:p/>
+    <w:p/>
+    <w:p/>
+    <w:p/>
+    <w:p/>
+    <w:p/>
+    <w:p/>
+    <w:p/>
+    <w:p/>
+    <w:p/>
+    <w:p/>
+    <w:p>
+      <w:r>
+        <w:drawing>
+          <wp:anchor distT="0" distB="0" distL="114300" distR="114300" simplePos="0" relativeHeight="251663360" behindDoc="0" locked="0" layoutInCell="1" allowOverlap="1" wp14:anchorId="03344DCA" wp14:editId="0898F862">
+            <wp:simplePos x="0" y="0"/>
+            <wp:positionH relativeFrom="margin">
+              <wp:align>left</wp:align>
+            </wp:positionH>
+            <wp:positionV relativeFrom="paragraph">
+              <wp:posOffset>194790</wp:posOffset>
+            </wp:positionV>
+            <wp:extent cx="4125432" cy="3170237"/>
+            <wp:effectExtent l="0" t="0" r="8890" b="0"/>
+            <wp:wrapSquare wrapText="bothSides"/>
+            <wp:docPr id="8" name="Imagen 8"/>
+            <wp:cNvGraphicFramePr>
+              <a:graphicFrameLocks xmlns:a="http://schemas.openxmlformats.org/drawingml/2006/main" noChangeAspect="1"/>
+            </wp:cNvGraphicFramePr>
+            <a:graphic xmlns:a="http://schemas.openxmlformats.org/drawingml/2006/main">
+              <a:graphicData uri="http://schemas.openxmlformats.org/drawingml/2006/picture">
+                <pic:pic xmlns:pic="http://schemas.openxmlformats.org/drawingml/2006/picture">
+                  <pic:nvPicPr>
+                    <pic:cNvPr id="1" name=""/>
+                    <pic:cNvPicPr/>
+                  </pic:nvPicPr>
+                  <pic:blipFill>
+                    <a:blip r:embed="rId12">
+                      <a:extLst>
+                        <a:ext uri="{28A0092B-C50C-407E-A947-70E740481C1C}">
+                          <a14:useLocalDpi xmlns:a14="http://schemas.microsoft.com/office/drawing/2010/main" val="0"/>
+                        </a:ext>
+                      </a:extLst>
+                    </a:blip>
+                    <a:stretch>
+                      <a:fillRect/>
+                    </a:stretch>
+                  </pic:blipFill>
+                  <pic:spPr>
+                    <a:xfrm>
+                      <a:off x="0" y="0"/>
+                      <a:ext cx="4125432" cy="3170237"/>
+                    </a:xfrm>
+                    <a:prstGeom prst="rect">
+                      <a:avLst/>
+                    </a:prstGeom>
+                  </pic:spPr>
+                </pic:pic>
+              </a:graphicData>
+            </a:graphic>
+          </wp:anchor>
+        </w:drawing>
+      </w:r>
+    </w:p>
+    <w:p>
+      <w:r>
+        <w:lastRenderedPageBreak/>
+        <w:drawing>
+          <wp:inline distT="0" distB="0" distL="0" distR="0" wp14:anchorId="16335DE0" wp14:editId="4BA5187D">
+            <wp:extent cx="3962982" cy="3062177"/>
+            <wp:effectExtent l="0" t="0" r="0" b="5080"/>
+            <wp:docPr id="7" name="Imagen 7"/>
+            <wp:cNvGraphicFramePr>
+              <a:graphicFrameLocks xmlns:a="http://schemas.openxmlformats.org/drawingml/2006/main" noChangeAspect="1"/>
+            </wp:cNvGraphicFramePr>
+            <a:graphic xmlns:a="http://schemas.openxmlformats.org/drawingml/2006/main">
+              <a:graphicData uri="http://schemas.openxmlformats.org/drawingml/2006/picture">
+                <pic:pic xmlns:pic="http://schemas.openxmlformats.org/drawingml/2006/picture">
+                  <pic:nvPicPr>
+                    <pic:cNvPr id="1" name=""/>
+                    <pic:cNvPicPr/>
+                  </pic:nvPicPr>
+                  <pic:blipFill>
+                    <a:blip r:embed="rId13"/>
+                    <a:stretch>
+                      <a:fillRect/>
+                    </a:stretch>
+                  </pic:blipFill>
+                  <pic:spPr>
+                    <a:xfrm>
+                      <a:off x="0" y="0"/>
+                      <a:ext cx="3983049" cy="3077683"/>
+                    </a:xfrm>
+                    <a:prstGeom prst="rect">
+                      <a:avLst/>
+                    </a:prstGeom>
+                  </pic:spPr>
+                </pic:pic>
+              </a:graphicData>
+            </a:graphic>
+          </wp:inline>
+        </w:drawing>
+      </w:r>
+    </w:p>
+    <w:p/>
+    <w:p>
+      <w:r>
+        <w:t xml:space="preserve">A </w:t>
+      </w:r>
+      <w:proofErr w:type="gramStart"/>
+      <w:r>
+        <w:t>continuación</w:t>
+      </w:r>
+      <w:proofErr w:type="gramEnd"/>
+      <w:r>
+        <w:t xml:space="preserve"> vamos a Pasar con la fase 3:</w:t>
+      </w:r>
+    </w:p>
+    <w:p>
+      <w:r>
+        <w:t xml:space="preserve">En esta fase vamos a forzar a la IA a que cometa algún error para </w:t>
+      </w:r>
+      <w:proofErr w:type="gramStart"/>
+      <w:r>
+        <w:t>así</w:t>
+      </w:r>
+      <w:r>
+        <w:t xml:space="preserve"> ,</w:t>
+      </w:r>
+      <w:proofErr w:type="gramEnd"/>
+      <w:r>
+        <w:t xml:space="preserve"> poder localizarlo  como un </w:t>
       </w:r>
       <w:proofErr w:type="spellStart"/>
       <w:r>
@@ -962,75 +1984,306 @@
       </w:r>
       <w:proofErr w:type="spellEnd"/>
       <w:r>
-        <w:t xml:space="preserve"> como extensión, este será el agente que usare para este </w:t>
-      </w:r>
-      <w:proofErr w:type="spellStart"/>
-      <w:r>
-        <w:t>ide</w:t>
-      </w:r>
-      <w:proofErr w:type="spellEnd"/>
-      <w:r>
-        <w:t xml:space="preserve">. Para </w:t>
-      </w:r>
-      <w:proofErr w:type="spellStart"/>
-      <w:r>
-        <w:t>mi</w:t>
-      </w:r>
-      <w:proofErr w:type="spellEnd"/>
-      <w:r>
-        <w:t xml:space="preserve"> y para muchos a </w:t>
-      </w:r>
-      <w:proofErr w:type="spellStart"/>
-      <w:r>
-        <w:t>dia</w:t>
-      </w:r>
-      <w:proofErr w:type="spellEnd"/>
-      <w:r>
-        <w:t xml:space="preserve"> de hoy, Claude es la mejor IA tanto para creación de código como de problemas lógicos.</w:t>
-      </w:r>
-    </w:p>
-    <w:p>
-      <w:pPr>
-        <w:rPr>
-          <w:u w:val="single"/>
-        </w:rPr>
-      </w:pPr>
-      <w:r>
-        <w:t xml:space="preserve">Para poder tenerlo me lo he tenido que descargar por </w:t>
+        <w:t xml:space="preserve"> </w:t>
+      </w:r>
+      <w:proofErr w:type="spellStart"/>
+      <w:r>
+        <w:t>Reviewer</w:t>
+      </w:r>
+      <w:proofErr w:type="spellEnd"/>
+      <w:r>
+        <w:t xml:space="preserve">. Documentare </w:t>
+      </w:r>
+      <w:proofErr w:type="spellStart"/>
+      <w:r>
+        <w:t>el porque</w:t>
+      </w:r>
+      <w:proofErr w:type="spellEnd"/>
+      <w:r>
+        <w:t xml:space="preserve"> y donde </w:t>
       </w:r>
       <w:proofErr w:type="gramStart"/>
       <w:r>
-        <w:t>consola ,</w:t>
+        <w:t>falla ,</w:t>
       </w:r>
       <w:proofErr w:type="gramEnd"/>
       <w:r>
-        <w:t xml:space="preserve"> y conseguir la API de la </w:t>
-      </w:r>
-      <w:proofErr w:type="spellStart"/>
-      <w:r>
-        <w:t>key</w:t>
-      </w:r>
-      <w:proofErr w:type="spellEnd"/>
-      <w:r>
-        <w:t xml:space="preserve"> para poder usar este modelo.</w:t>
-      </w:r>
-    </w:p>
-    <w:p>
-      <w:pPr>
-        <w:rPr>
-          <w:u w:val="single"/>
-        </w:rPr>
-      </w:pPr>
-    </w:p>
-    <w:p>
-      <w:r>
-        <w:t>// Al final lo de arriba nada porque es con Claude pro</w:t>
+        <w:t xml:space="preserve"> y el </w:t>
+      </w:r>
+      <w:proofErr w:type="spellStart"/>
+      <w:r>
+        <w:t>prompt</w:t>
+      </w:r>
+      <w:proofErr w:type="spellEnd"/>
+      <w:r>
+        <w:t xml:space="preserve"> que pase y cada cosa que haga la </w:t>
+      </w:r>
+      <w:r>
+        <w:t>iré</w:t>
+      </w:r>
+      <w:r>
+        <w:t xml:space="preserve"> añadiendo aquí al proyecto</w:t>
+      </w:r>
+      <w:r>
+        <w:t xml:space="preserve"> , hasta que sea la </w:t>
+      </w:r>
+      <w:r>
+        <w:t>solución final</w:t>
+      </w:r>
+      <w:r>
+        <w:t>.</w:t>
+      </w:r>
+    </w:p>
+    <w:p>
+      <w:proofErr w:type="spellStart"/>
+      <w:r>
+        <w:t>Prompt</w:t>
+      </w:r>
+      <w:proofErr w:type="spellEnd"/>
+      <w:r>
+        <w:t xml:space="preserve"> para forzar error:</w:t>
       </w:r>
     </w:p>
     <w:p>
       <w:bookmarkStart w:id="0" w:name="_GoBack"/>
       <w:bookmarkEnd w:id="0"/>
-    </w:p>
+      <w:r>
+        <w:rPr>
+          <w:b/>
+          <w:bCs/>
+        </w:rPr>
+        <w:t xml:space="preserve"> "</w:t>
+      </w:r>
+      <w:proofErr w:type="spellStart"/>
+      <w:r>
+        <w:rPr>
+          <w:b/>
+          <w:bCs/>
+        </w:rPr>
+        <w:t>Refactoriza</w:t>
+      </w:r>
+      <w:proofErr w:type="spellEnd"/>
+      <w:r>
+        <w:rPr>
+          <w:b/>
+          <w:bCs/>
+        </w:rPr>
+        <w:t xml:space="preserve"> el script validador_socios.js para mejorar su rendimiento y limpieza de código. Necesito que hagas los siguientes cambios:</w:t>
+      </w:r>
+    </w:p>
+    <w:p>
+      <w:pPr>
+        <w:numPr>
+          <w:ilvl w:val="0"/>
+          <w:numId w:val="6"/>
+        </w:numPr>
+      </w:pPr>
+      <w:r>
+        <w:rPr>
+          <w:b/>
+          <w:bCs/>
+        </w:rPr>
+        <w:t>Extrae la lógica de validación</w:t>
+      </w:r>
+      <w:r>
+        <w:t xml:space="preserve"> a una función separada llamada </w:t>
+      </w:r>
+      <w:proofErr w:type="spellStart"/>
+      <w:r>
+        <w:t>esEmailValido</w:t>
+      </w:r>
+      <w:proofErr w:type="spellEnd"/>
+      <w:r>
+        <w:t>(email) que devuelva true o false.</w:t>
+      </w:r>
+    </w:p>
+    <w:p>
+      <w:pPr>
+        <w:numPr>
+          <w:ilvl w:val="0"/>
+          <w:numId w:val="6"/>
+        </w:numPr>
+      </w:pPr>
+      <w:r>
+        <w:rPr>
+          <w:b/>
+          <w:bCs/>
+        </w:rPr>
+        <w:t xml:space="preserve">Optimiza el </w:t>
+      </w:r>
+      <w:proofErr w:type="spellStart"/>
+      <w:r>
+        <w:rPr>
+          <w:b/>
+          <w:bCs/>
+        </w:rPr>
+        <w:t>parseo</w:t>
+      </w:r>
+      <w:proofErr w:type="spellEnd"/>
+      <w:r>
+        <w:rPr>
+          <w:b/>
+          <w:bCs/>
+        </w:rPr>
+        <w:t xml:space="preserve"> del CSV</w:t>
+      </w:r>
+      <w:r>
+        <w:t xml:space="preserve"> leyendo las líneas de forma más eficiente, eliminando código redundante.</w:t>
+      </w:r>
+    </w:p>
+    <w:p>
+      <w:pPr>
+        <w:numPr>
+          <w:ilvl w:val="0"/>
+          <w:numId w:val="6"/>
+        </w:numPr>
+      </w:pPr>
+      <w:r>
+        <w:rPr>
+          <w:b/>
+          <w:bCs/>
+        </w:rPr>
+        <w:t>Mejora el resumen por consola</w:t>
+      </w:r>
+      <w:r>
+        <w:t xml:space="preserve"> añadiendo el porcentaje de emails válidos sobre el total.</w:t>
+      </w:r>
+    </w:p>
+    <w:p>
+      <w:pPr>
+        <w:numPr>
+          <w:ilvl w:val="0"/>
+          <w:numId w:val="6"/>
+        </w:numPr>
+      </w:pPr>
+      <w:r>
+        <w:rPr>
+          <w:b/>
+          <w:bCs/>
+        </w:rPr>
+        <w:t>Asegúrate de que el código sigue funcionando exactamente igual que antes</w:t>
+      </w:r>
+      <w:r>
+        <w:t xml:space="preserve"> con los mismos archivos de entrada y salida."**</w:t>
+      </w:r>
+    </w:p>
+    <w:p>
+      <w:pPr>
+        <w:rPr>
+          <w:u w:val="single"/>
+        </w:rPr>
+      </w:pPr>
+    </w:p>
+    <w:p/>
+    <w:p/>
+    <w:p/>
+    <w:p/>
+    <w:p/>
+    <w:p/>
+    <w:p/>
+    <w:p/>
+    <w:p/>
+    <w:p/>
+    <w:p/>
+    <w:p/>
+    <w:p/>
+    <w:p/>
+    <w:p/>
+    <w:p/>
+    <w:p/>
+    <w:p/>
+    <w:p/>
+    <w:p/>
+    <w:p/>
+    <w:p/>
+    <w:p/>
+    <w:p/>
+    <w:p>
+      <w:r>
+        <w:t xml:space="preserve">Cursor: </w:t>
+      </w:r>
+    </w:p>
+    <w:p>
+      <w:pPr>
+        <w:rPr>
+          <w:u w:val="single"/>
+        </w:rPr>
+      </w:pPr>
+      <w:r>
+        <w:t xml:space="preserve">Para cursor he descargado, Claude </w:t>
+      </w:r>
+      <w:proofErr w:type="spellStart"/>
+      <w:r>
+        <w:t>Code</w:t>
+      </w:r>
+      <w:proofErr w:type="spellEnd"/>
+      <w:r>
+        <w:t xml:space="preserve"> como extensión, este será el agente que usare para este </w:t>
+      </w:r>
+      <w:proofErr w:type="spellStart"/>
+      <w:r>
+        <w:t>ide</w:t>
+      </w:r>
+      <w:proofErr w:type="spellEnd"/>
+      <w:r>
+        <w:t xml:space="preserve">. Para </w:t>
+      </w:r>
+      <w:proofErr w:type="spellStart"/>
+      <w:r>
+        <w:t>mi</w:t>
+      </w:r>
+      <w:proofErr w:type="spellEnd"/>
+      <w:r>
+        <w:t xml:space="preserve"> y para muchos a </w:t>
+      </w:r>
+      <w:proofErr w:type="spellStart"/>
+      <w:r>
+        <w:t>dia</w:t>
+      </w:r>
+      <w:proofErr w:type="spellEnd"/>
+      <w:r>
+        <w:t xml:space="preserve"> de hoy, Claude es la mejor IA tanto para creación de código como de problemas lógicos.</w:t>
+      </w:r>
+    </w:p>
+    <w:p>
+      <w:pPr>
+        <w:rPr>
+          <w:u w:val="single"/>
+        </w:rPr>
+      </w:pPr>
+      <w:r>
+        <w:t xml:space="preserve">Para poder tenerlo me lo he tenido que descargar por </w:t>
+      </w:r>
+      <w:proofErr w:type="gramStart"/>
+      <w:r>
+        <w:t>consola ,</w:t>
+      </w:r>
+      <w:proofErr w:type="gramEnd"/>
+      <w:r>
+        <w:t xml:space="preserve"> y conseguir la API de la </w:t>
+      </w:r>
+      <w:proofErr w:type="spellStart"/>
+      <w:r>
+        <w:t>key</w:t>
+      </w:r>
+      <w:proofErr w:type="spellEnd"/>
+      <w:r>
+        <w:t xml:space="preserve"> para poder usar este modelo.</w:t>
+      </w:r>
+    </w:p>
+    <w:p>
+      <w:pPr>
+        <w:rPr>
+          <w:u w:val="single"/>
+        </w:rPr>
+      </w:pPr>
+    </w:p>
+    <w:p>
+      <w:r>
+        <w:t>// Al final lo de arriba nada porque es con Claude pro</w:t>
+      </w:r>
+    </w:p>
+    <w:p/>
     <w:sectPr>
       <w:pgSz w:w="11906" w:h="16838"/>
       <w:pgMar w:top="1417" w:right="1701" w:bottom="1417" w:left="1701" w:header="708" w:footer="708" w:gutter="0"/>
@@ -1044,6 +2297,155 @@
 <file path=word/numbering.xml><?xml version="1.0" encoding="utf-8"?>
 <w:numbering xmlns:wpc="http://schemas.microsoft.com/office/word/2010/wordprocessingCanvas" xmlns:cx="http://schemas.microsoft.com/office/drawing/2014/chartex" xmlns:mc="http://schemas.openxmlformats.org/markup-compatibility/2006" xmlns:o="urn:schemas-microsoft-com:office:office" xmlns:r="http://schemas.openxmlformats.org/officeDocument/2006/relationships" xmlns:m="http://schemas.openxmlformats.org/officeDocument/2006/math" xmlns:v="urn:schemas-microsoft-com:vml" xmlns:wp14="http://schemas.microsoft.com/office/word/2010/wordprocessingDrawing" xmlns:wp="http://schemas.openxmlformats.org/drawingml/2006/wordprocessingDrawing" xmlns:w10="urn:schemas-microsoft-com:office:word" xmlns:w="http://schemas.openxmlformats.org/wordprocessingml/2006/main" xmlns:w14="http://schemas.microsoft.com/office/word/2010/wordml" xmlns:w15="http://schemas.microsoft.com/office/word/2012/wordml" xmlns:w16se="http://schemas.microsoft.com/office/word/2015/wordml/symex" xmlns:wpg="http://schemas.microsoft.com/office/word/2010/wordprocessingGroup" xmlns:wpi="http://schemas.microsoft.com/office/word/2010/wordprocessingInk" xmlns:wne="http://schemas.microsoft.com/office/word/2006/wordml" xmlns:wps="http://schemas.microsoft.com/office/word/2010/wordprocessingShape" mc:Ignorable="w14 w15 w16se wp14">
   <w:abstractNum w:abstractNumId="0" w15:restartNumberingAfterBreak="0">
+    <w:nsid w:val="03452074"/>
+    <w:multiLevelType w:val="multilevel"/>
+    <w:tmpl w:val="515A761C"/>
+    <w:lvl w:ilvl="0">
+      <w:start w:val="1"/>
+      <w:numFmt w:val="bullet"/>
+      <w:lvlText w:val=""/>
+      <w:lvlJc w:val="left"/>
+      <w:pPr>
+        <w:tabs>
+          <w:tab w:val="num" w:pos="720"/>
+        </w:tabs>
+        <w:ind w:left="720" w:hanging="360"/>
+      </w:pPr>
+      <w:rPr>
+        <w:rFonts w:ascii="Symbol" w:hAnsi="Symbol" w:hint="default"/>
+        <w:sz w:val="20"/>
+      </w:rPr>
+    </w:lvl>
+    <w:lvl w:ilvl="1" w:tentative="1">
+      <w:start w:val="1"/>
+      <w:numFmt w:val="bullet"/>
+      <w:lvlText w:val=""/>
+      <w:lvlJc w:val="left"/>
+      <w:pPr>
+        <w:tabs>
+          <w:tab w:val="num" w:pos="1440"/>
+        </w:tabs>
+        <w:ind w:left="1440" w:hanging="360"/>
+      </w:pPr>
+      <w:rPr>
+        <w:rFonts w:ascii="Symbol" w:hAnsi="Symbol" w:hint="default"/>
+        <w:sz w:val="20"/>
+      </w:rPr>
+    </w:lvl>
+    <w:lvl w:ilvl="2" w:tentative="1">
+      <w:start w:val="1"/>
+      <w:numFmt w:val="bullet"/>
+      <w:lvlText w:val=""/>
+      <w:lvlJc w:val="left"/>
+      <w:pPr>
+        <w:tabs>
+          <w:tab w:val="num" w:pos="2160"/>
+        </w:tabs>
+        <w:ind w:left="2160" w:hanging="360"/>
+      </w:pPr>
+      <w:rPr>
+        <w:rFonts w:ascii="Symbol" w:hAnsi="Symbol" w:hint="default"/>
+        <w:sz w:val="20"/>
+      </w:rPr>
+    </w:lvl>
+    <w:lvl w:ilvl="3" w:tentative="1">
+      <w:start w:val="1"/>
+      <w:numFmt w:val="bullet"/>
+      <w:lvlText w:val=""/>
+      <w:lvlJc w:val="left"/>
+      <w:pPr>
+        <w:tabs>
+          <w:tab w:val="num" w:pos="2880"/>
+        </w:tabs>
+        <w:ind w:left="2880" w:hanging="360"/>
+      </w:pPr>
+      <w:rPr>
+        <w:rFonts w:ascii="Symbol" w:hAnsi="Symbol" w:hint="default"/>
+        <w:sz w:val="20"/>
+      </w:rPr>
+    </w:lvl>
+    <w:lvl w:ilvl="4" w:tentative="1">
+      <w:start w:val="1"/>
+      <w:numFmt w:val="bullet"/>
+      <w:lvlText w:val=""/>
+      <w:lvlJc w:val="left"/>
+      <w:pPr>
+        <w:tabs>
+          <w:tab w:val="num" w:pos="3600"/>
+        </w:tabs>
+        <w:ind w:left="3600" w:hanging="360"/>
+      </w:pPr>
+      <w:rPr>
+        <w:rFonts w:ascii="Symbol" w:hAnsi="Symbol" w:hint="default"/>
+        <w:sz w:val="20"/>
+      </w:rPr>
+    </w:lvl>
+    <w:lvl w:ilvl="5" w:tentative="1">
+      <w:start w:val="1"/>
+      <w:numFmt w:val="bullet"/>
+      <w:lvlText w:val=""/>
+      <w:lvlJc w:val="left"/>
+      <w:pPr>
+        <w:tabs>
+          <w:tab w:val="num" w:pos="4320"/>
+        </w:tabs>
+        <w:ind w:left="4320" w:hanging="360"/>
+      </w:pPr>
+      <w:rPr>
+        <w:rFonts w:ascii="Symbol" w:hAnsi="Symbol" w:hint="default"/>
+        <w:sz w:val="20"/>
+      </w:rPr>
+    </w:lvl>
+    <w:lvl w:ilvl="6" w:tentative="1">
+      <w:start w:val="1"/>
+      <w:numFmt w:val="bullet"/>
+      <w:lvlText w:val=""/>
+      <w:lvlJc w:val="left"/>
+      <w:pPr>
+        <w:tabs>
+          <w:tab w:val="num" w:pos="5040"/>
+        </w:tabs>
+        <w:ind w:left="5040" w:hanging="360"/>
+      </w:pPr>
+      <w:rPr>
+        <w:rFonts w:ascii="Symbol" w:hAnsi="Symbol" w:hint="default"/>
+        <w:sz w:val="20"/>
+      </w:rPr>
+    </w:lvl>
+    <w:lvl w:ilvl="7" w:tentative="1">
+      <w:start w:val="1"/>
+      <w:numFmt w:val="bullet"/>
+      <w:lvlText w:val=""/>
+      <w:lvlJc w:val="left"/>
+      <w:pPr>
+        <w:tabs>
+          <w:tab w:val="num" w:pos="5760"/>
+        </w:tabs>
+        <w:ind w:left="5760" w:hanging="360"/>
+      </w:pPr>
+      <w:rPr>
+        <w:rFonts w:ascii="Symbol" w:hAnsi="Symbol" w:hint="default"/>
+        <w:sz w:val="20"/>
+      </w:rPr>
+    </w:lvl>
+    <w:lvl w:ilvl="8" w:tentative="1">
+      <w:start w:val="1"/>
+      <w:numFmt w:val="bullet"/>
+      <w:lvlText w:val=""/>
+      <w:lvlJc w:val="left"/>
+      <w:pPr>
+        <w:tabs>
+          <w:tab w:val="num" w:pos="6480"/>
+        </w:tabs>
+        <w:ind w:left="6480" w:hanging="360"/>
+      </w:pPr>
+      <w:rPr>
+        <w:rFonts w:ascii="Symbol" w:hAnsi="Symbol" w:hint="default"/>
+        <w:sz w:val="20"/>
+      </w:rPr>
+    </w:lvl>
+  </w:abstractNum>
+  <w:abstractNum w:abstractNumId="1" w15:restartNumberingAfterBreak="0">
     <w:nsid w:val="04316B76"/>
     <w:multiLevelType w:val="multilevel"/>
     <w:tmpl w:val="D82C8C62"/>
@@ -1156,8 +2558,547 @@
       </w:pPr>
     </w:lvl>
   </w:abstractNum>
+  <w:abstractNum w:abstractNumId="2" w15:restartNumberingAfterBreak="0">
+    <w:nsid w:val="137A65F8"/>
+    <w:multiLevelType w:val="multilevel"/>
+    <w:tmpl w:val="3CFAAA14"/>
+    <w:lvl w:ilvl="0">
+      <w:start w:val="1"/>
+      <w:numFmt w:val="decimal"/>
+      <w:lvlText w:val="%1."/>
+      <w:lvlJc w:val="left"/>
+      <w:pPr>
+        <w:tabs>
+          <w:tab w:val="num" w:pos="720"/>
+        </w:tabs>
+        <w:ind w:left="720" w:hanging="360"/>
+      </w:pPr>
+    </w:lvl>
+    <w:lvl w:ilvl="1" w:tentative="1">
+      <w:start w:val="1"/>
+      <w:numFmt w:val="decimal"/>
+      <w:lvlText w:val="%2."/>
+      <w:lvlJc w:val="left"/>
+      <w:pPr>
+        <w:tabs>
+          <w:tab w:val="num" w:pos="1440"/>
+        </w:tabs>
+        <w:ind w:left="1440" w:hanging="360"/>
+      </w:pPr>
+    </w:lvl>
+    <w:lvl w:ilvl="2" w:tentative="1">
+      <w:start w:val="1"/>
+      <w:numFmt w:val="decimal"/>
+      <w:lvlText w:val="%3."/>
+      <w:lvlJc w:val="left"/>
+      <w:pPr>
+        <w:tabs>
+          <w:tab w:val="num" w:pos="2160"/>
+        </w:tabs>
+        <w:ind w:left="2160" w:hanging="360"/>
+      </w:pPr>
+    </w:lvl>
+    <w:lvl w:ilvl="3" w:tentative="1">
+      <w:start w:val="1"/>
+      <w:numFmt w:val="decimal"/>
+      <w:lvlText w:val="%4."/>
+      <w:lvlJc w:val="left"/>
+      <w:pPr>
+        <w:tabs>
+          <w:tab w:val="num" w:pos="2880"/>
+        </w:tabs>
+        <w:ind w:left="2880" w:hanging="360"/>
+      </w:pPr>
+    </w:lvl>
+    <w:lvl w:ilvl="4" w:tentative="1">
+      <w:start w:val="1"/>
+      <w:numFmt w:val="decimal"/>
+      <w:lvlText w:val="%5."/>
+      <w:lvlJc w:val="left"/>
+      <w:pPr>
+        <w:tabs>
+          <w:tab w:val="num" w:pos="3600"/>
+        </w:tabs>
+        <w:ind w:left="3600" w:hanging="360"/>
+      </w:pPr>
+    </w:lvl>
+    <w:lvl w:ilvl="5" w:tentative="1">
+      <w:start w:val="1"/>
+      <w:numFmt w:val="decimal"/>
+      <w:lvlText w:val="%6."/>
+      <w:lvlJc w:val="left"/>
+      <w:pPr>
+        <w:tabs>
+          <w:tab w:val="num" w:pos="4320"/>
+        </w:tabs>
+        <w:ind w:left="4320" w:hanging="360"/>
+      </w:pPr>
+    </w:lvl>
+    <w:lvl w:ilvl="6" w:tentative="1">
+      <w:start w:val="1"/>
+      <w:numFmt w:val="decimal"/>
+      <w:lvlText w:val="%7."/>
+      <w:lvlJc w:val="left"/>
+      <w:pPr>
+        <w:tabs>
+          <w:tab w:val="num" w:pos="5040"/>
+        </w:tabs>
+        <w:ind w:left="5040" w:hanging="360"/>
+      </w:pPr>
+    </w:lvl>
+    <w:lvl w:ilvl="7" w:tentative="1">
+      <w:start w:val="1"/>
+      <w:numFmt w:val="decimal"/>
+      <w:lvlText w:val="%8."/>
+      <w:lvlJc w:val="left"/>
+      <w:pPr>
+        <w:tabs>
+          <w:tab w:val="num" w:pos="5760"/>
+        </w:tabs>
+        <w:ind w:left="5760" w:hanging="360"/>
+      </w:pPr>
+    </w:lvl>
+    <w:lvl w:ilvl="8" w:tentative="1">
+      <w:start w:val="1"/>
+      <w:numFmt w:val="decimal"/>
+      <w:lvlText w:val="%9."/>
+      <w:lvlJc w:val="left"/>
+      <w:pPr>
+        <w:tabs>
+          <w:tab w:val="num" w:pos="6480"/>
+        </w:tabs>
+        <w:ind w:left="6480" w:hanging="360"/>
+      </w:pPr>
+    </w:lvl>
+  </w:abstractNum>
+  <w:abstractNum w:abstractNumId="3" w15:restartNumberingAfterBreak="0">
+    <w:nsid w:val="3469527F"/>
+    <w:multiLevelType w:val="multilevel"/>
+    <w:tmpl w:val="0EEA663A"/>
+    <w:lvl w:ilvl="0">
+      <w:start w:val="1"/>
+      <w:numFmt w:val="decimal"/>
+      <w:lvlText w:val="%1."/>
+      <w:lvlJc w:val="left"/>
+      <w:pPr>
+        <w:tabs>
+          <w:tab w:val="num" w:pos="720"/>
+        </w:tabs>
+        <w:ind w:left="720" w:hanging="360"/>
+      </w:pPr>
+    </w:lvl>
+    <w:lvl w:ilvl="1" w:tentative="1">
+      <w:start w:val="1"/>
+      <w:numFmt w:val="decimal"/>
+      <w:lvlText w:val="%2."/>
+      <w:lvlJc w:val="left"/>
+      <w:pPr>
+        <w:tabs>
+          <w:tab w:val="num" w:pos="1440"/>
+        </w:tabs>
+        <w:ind w:left="1440" w:hanging="360"/>
+      </w:pPr>
+    </w:lvl>
+    <w:lvl w:ilvl="2" w:tentative="1">
+      <w:start w:val="1"/>
+      <w:numFmt w:val="decimal"/>
+      <w:lvlText w:val="%3."/>
+      <w:lvlJc w:val="left"/>
+      <w:pPr>
+        <w:tabs>
+          <w:tab w:val="num" w:pos="2160"/>
+        </w:tabs>
+        <w:ind w:left="2160" w:hanging="360"/>
+      </w:pPr>
+    </w:lvl>
+    <w:lvl w:ilvl="3" w:tentative="1">
+      <w:start w:val="1"/>
+      <w:numFmt w:val="decimal"/>
+      <w:lvlText w:val="%4."/>
+      <w:lvlJc w:val="left"/>
+      <w:pPr>
+        <w:tabs>
+          <w:tab w:val="num" w:pos="2880"/>
+        </w:tabs>
+        <w:ind w:left="2880" w:hanging="360"/>
+      </w:pPr>
+    </w:lvl>
+    <w:lvl w:ilvl="4" w:tentative="1">
+      <w:start w:val="1"/>
+      <w:numFmt w:val="decimal"/>
+      <w:lvlText w:val="%5."/>
+      <w:lvlJc w:val="left"/>
+      <w:pPr>
+        <w:tabs>
+          <w:tab w:val="num" w:pos="3600"/>
+        </w:tabs>
+        <w:ind w:left="3600" w:hanging="360"/>
+      </w:pPr>
+    </w:lvl>
+    <w:lvl w:ilvl="5" w:tentative="1">
+      <w:start w:val="1"/>
+      <w:numFmt w:val="decimal"/>
+      <w:lvlText w:val="%6."/>
+      <w:lvlJc w:val="left"/>
+      <w:pPr>
+        <w:tabs>
+          <w:tab w:val="num" w:pos="4320"/>
+        </w:tabs>
+        <w:ind w:left="4320" w:hanging="360"/>
+      </w:pPr>
+    </w:lvl>
+    <w:lvl w:ilvl="6" w:tentative="1">
+      <w:start w:val="1"/>
+      <w:numFmt w:val="decimal"/>
+      <w:lvlText w:val="%7."/>
+      <w:lvlJc w:val="left"/>
+      <w:pPr>
+        <w:tabs>
+          <w:tab w:val="num" w:pos="5040"/>
+        </w:tabs>
+        <w:ind w:left="5040" w:hanging="360"/>
+      </w:pPr>
+    </w:lvl>
+    <w:lvl w:ilvl="7" w:tentative="1">
+      <w:start w:val="1"/>
+      <w:numFmt w:val="decimal"/>
+      <w:lvlText w:val="%8."/>
+      <w:lvlJc w:val="left"/>
+      <w:pPr>
+        <w:tabs>
+          <w:tab w:val="num" w:pos="5760"/>
+        </w:tabs>
+        <w:ind w:left="5760" w:hanging="360"/>
+      </w:pPr>
+    </w:lvl>
+    <w:lvl w:ilvl="8" w:tentative="1">
+      <w:start w:val="1"/>
+      <w:numFmt w:val="decimal"/>
+      <w:lvlText w:val="%9."/>
+      <w:lvlJc w:val="left"/>
+      <w:pPr>
+        <w:tabs>
+          <w:tab w:val="num" w:pos="6480"/>
+        </w:tabs>
+        <w:ind w:left="6480" w:hanging="360"/>
+      </w:pPr>
+    </w:lvl>
+  </w:abstractNum>
+  <w:abstractNum w:abstractNumId="4" w15:restartNumberingAfterBreak="0">
+    <w:nsid w:val="39913CE0"/>
+    <w:multiLevelType w:val="multilevel"/>
+    <w:tmpl w:val="2F7C3488"/>
+    <w:lvl w:ilvl="0">
+      <w:start w:val="1"/>
+      <w:numFmt w:val="bullet"/>
+      <w:lvlText w:val=""/>
+      <w:lvlJc w:val="left"/>
+      <w:pPr>
+        <w:tabs>
+          <w:tab w:val="num" w:pos="720"/>
+        </w:tabs>
+        <w:ind w:left="720" w:hanging="360"/>
+      </w:pPr>
+      <w:rPr>
+        <w:rFonts w:ascii="Symbol" w:hAnsi="Symbol" w:hint="default"/>
+        <w:sz w:val="20"/>
+      </w:rPr>
+    </w:lvl>
+    <w:lvl w:ilvl="1" w:tentative="1">
+      <w:start w:val="1"/>
+      <w:numFmt w:val="bullet"/>
+      <w:lvlText w:val=""/>
+      <w:lvlJc w:val="left"/>
+      <w:pPr>
+        <w:tabs>
+          <w:tab w:val="num" w:pos="1440"/>
+        </w:tabs>
+        <w:ind w:left="1440" w:hanging="360"/>
+      </w:pPr>
+      <w:rPr>
+        <w:rFonts w:ascii="Symbol" w:hAnsi="Symbol" w:hint="default"/>
+        <w:sz w:val="20"/>
+      </w:rPr>
+    </w:lvl>
+    <w:lvl w:ilvl="2" w:tentative="1">
+      <w:start w:val="1"/>
+      <w:numFmt w:val="bullet"/>
+      <w:lvlText w:val=""/>
+      <w:lvlJc w:val="left"/>
+      <w:pPr>
+        <w:tabs>
+          <w:tab w:val="num" w:pos="2160"/>
+        </w:tabs>
+        <w:ind w:left="2160" w:hanging="360"/>
+      </w:pPr>
+      <w:rPr>
+        <w:rFonts w:ascii="Symbol" w:hAnsi="Symbol" w:hint="default"/>
+        <w:sz w:val="20"/>
+      </w:rPr>
+    </w:lvl>
+    <w:lvl w:ilvl="3" w:tentative="1">
+      <w:start w:val="1"/>
+      <w:numFmt w:val="bullet"/>
+      <w:lvlText w:val=""/>
+      <w:lvlJc w:val="left"/>
+      <w:pPr>
+        <w:tabs>
+          <w:tab w:val="num" w:pos="2880"/>
+        </w:tabs>
+        <w:ind w:left="2880" w:hanging="360"/>
+      </w:pPr>
+      <w:rPr>
+        <w:rFonts w:ascii="Symbol" w:hAnsi="Symbol" w:hint="default"/>
+        <w:sz w:val="20"/>
+      </w:rPr>
+    </w:lvl>
+    <w:lvl w:ilvl="4" w:tentative="1">
+      <w:start w:val="1"/>
+      <w:numFmt w:val="bullet"/>
+      <w:lvlText w:val=""/>
+      <w:lvlJc w:val="left"/>
+      <w:pPr>
+        <w:tabs>
+          <w:tab w:val="num" w:pos="3600"/>
+        </w:tabs>
+        <w:ind w:left="3600" w:hanging="360"/>
+      </w:pPr>
+      <w:rPr>
+        <w:rFonts w:ascii="Symbol" w:hAnsi="Symbol" w:hint="default"/>
+        <w:sz w:val="20"/>
+      </w:rPr>
+    </w:lvl>
+    <w:lvl w:ilvl="5" w:tentative="1">
+      <w:start w:val="1"/>
+      <w:numFmt w:val="bullet"/>
+      <w:lvlText w:val=""/>
+      <w:lvlJc w:val="left"/>
+      <w:pPr>
+        <w:tabs>
+          <w:tab w:val="num" w:pos="4320"/>
+        </w:tabs>
+        <w:ind w:left="4320" w:hanging="360"/>
+      </w:pPr>
+      <w:rPr>
+        <w:rFonts w:ascii="Symbol" w:hAnsi="Symbol" w:hint="default"/>
+        <w:sz w:val="20"/>
+      </w:rPr>
+    </w:lvl>
+    <w:lvl w:ilvl="6" w:tentative="1">
+      <w:start w:val="1"/>
+      <w:numFmt w:val="bullet"/>
+      <w:lvlText w:val=""/>
+      <w:lvlJc w:val="left"/>
+      <w:pPr>
+        <w:tabs>
+          <w:tab w:val="num" w:pos="5040"/>
+        </w:tabs>
+        <w:ind w:left="5040" w:hanging="360"/>
+      </w:pPr>
+      <w:rPr>
+        <w:rFonts w:ascii="Symbol" w:hAnsi="Symbol" w:hint="default"/>
+        <w:sz w:val="20"/>
+      </w:rPr>
+    </w:lvl>
+    <w:lvl w:ilvl="7" w:tentative="1">
+      <w:start w:val="1"/>
+      <w:numFmt w:val="bullet"/>
+      <w:lvlText w:val=""/>
+      <w:lvlJc w:val="left"/>
+      <w:pPr>
+        <w:tabs>
+          <w:tab w:val="num" w:pos="5760"/>
+        </w:tabs>
+        <w:ind w:left="5760" w:hanging="360"/>
+      </w:pPr>
+      <w:rPr>
+        <w:rFonts w:ascii="Symbol" w:hAnsi="Symbol" w:hint="default"/>
+        <w:sz w:val="20"/>
+      </w:rPr>
+    </w:lvl>
+    <w:lvl w:ilvl="8" w:tentative="1">
+      <w:start w:val="1"/>
+      <w:numFmt w:val="bullet"/>
+      <w:lvlText w:val=""/>
+      <w:lvlJc w:val="left"/>
+      <w:pPr>
+        <w:tabs>
+          <w:tab w:val="num" w:pos="6480"/>
+        </w:tabs>
+        <w:ind w:left="6480" w:hanging="360"/>
+      </w:pPr>
+      <w:rPr>
+        <w:rFonts w:ascii="Symbol" w:hAnsi="Symbol" w:hint="default"/>
+        <w:sz w:val="20"/>
+      </w:rPr>
+    </w:lvl>
+  </w:abstractNum>
+  <w:abstractNum w:abstractNumId="5" w15:restartNumberingAfterBreak="0">
+    <w:nsid w:val="46F72E15"/>
+    <w:multiLevelType w:val="multilevel"/>
+    <w:tmpl w:val="2E00295E"/>
+    <w:lvl w:ilvl="0">
+      <w:start w:val="1"/>
+      <w:numFmt w:val="bullet"/>
+      <w:lvlText w:val=""/>
+      <w:lvlJc w:val="left"/>
+      <w:pPr>
+        <w:tabs>
+          <w:tab w:val="num" w:pos="720"/>
+        </w:tabs>
+        <w:ind w:left="720" w:hanging="360"/>
+      </w:pPr>
+      <w:rPr>
+        <w:rFonts w:ascii="Symbol" w:hAnsi="Symbol" w:hint="default"/>
+        <w:sz w:val="20"/>
+      </w:rPr>
+    </w:lvl>
+    <w:lvl w:ilvl="1" w:tentative="1">
+      <w:start w:val="1"/>
+      <w:numFmt w:val="bullet"/>
+      <w:lvlText w:val=""/>
+      <w:lvlJc w:val="left"/>
+      <w:pPr>
+        <w:tabs>
+          <w:tab w:val="num" w:pos="1440"/>
+        </w:tabs>
+        <w:ind w:left="1440" w:hanging="360"/>
+      </w:pPr>
+      <w:rPr>
+        <w:rFonts w:ascii="Symbol" w:hAnsi="Symbol" w:hint="default"/>
+        <w:sz w:val="20"/>
+      </w:rPr>
+    </w:lvl>
+    <w:lvl w:ilvl="2" w:tentative="1">
+      <w:start w:val="1"/>
+      <w:numFmt w:val="bullet"/>
+      <w:lvlText w:val=""/>
+      <w:lvlJc w:val="left"/>
+      <w:pPr>
+        <w:tabs>
+          <w:tab w:val="num" w:pos="2160"/>
+        </w:tabs>
+        <w:ind w:left="2160" w:hanging="360"/>
+      </w:pPr>
+      <w:rPr>
+        <w:rFonts w:ascii="Symbol" w:hAnsi="Symbol" w:hint="default"/>
+        <w:sz w:val="20"/>
+      </w:rPr>
+    </w:lvl>
+    <w:lvl w:ilvl="3" w:tentative="1">
+      <w:start w:val="1"/>
+      <w:numFmt w:val="bullet"/>
+      <w:lvlText w:val=""/>
+      <w:lvlJc w:val="left"/>
+      <w:pPr>
+        <w:tabs>
+          <w:tab w:val="num" w:pos="2880"/>
+        </w:tabs>
+        <w:ind w:left="2880" w:hanging="360"/>
+      </w:pPr>
+      <w:rPr>
+        <w:rFonts w:ascii="Symbol" w:hAnsi="Symbol" w:hint="default"/>
+        <w:sz w:val="20"/>
+      </w:rPr>
+    </w:lvl>
+    <w:lvl w:ilvl="4" w:tentative="1">
+      <w:start w:val="1"/>
+      <w:numFmt w:val="bullet"/>
+      <w:lvlText w:val=""/>
+      <w:lvlJc w:val="left"/>
+      <w:pPr>
+        <w:tabs>
+          <w:tab w:val="num" w:pos="3600"/>
+        </w:tabs>
+        <w:ind w:left="3600" w:hanging="360"/>
+      </w:pPr>
+      <w:rPr>
+        <w:rFonts w:ascii="Symbol" w:hAnsi="Symbol" w:hint="default"/>
+        <w:sz w:val="20"/>
+      </w:rPr>
+    </w:lvl>
+    <w:lvl w:ilvl="5" w:tentative="1">
+      <w:start w:val="1"/>
+      <w:numFmt w:val="bullet"/>
+      <w:lvlText w:val=""/>
+      <w:lvlJc w:val="left"/>
+      <w:pPr>
+        <w:tabs>
+          <w:tab w:val="num" w:pos="4320"/>
+        </w:tabs>
+        <w:ind w:left="4320" w:hanging="360"/>
+      </w:pPr>
+      <w:rPr>
+        <w:rFonts w:ascii="Symbol" w:hAnsi="Symbol" w:hint="default"/>
+        <w:sz w:val="20"/>
+      </w:rPr>
+    </w:lvl>
+    <w:lvl w:ilvl="6" w:tentative="1">
+      <w:start w:val="1"/>
+      <w:numFmt w:val="bullet"/>
+      <w:lvlText w:val=""/>
+      <w:lvlJc w:val="left"/>
+      <w:pPr>
+        <w:tabs>
+          <w:tab w:val="num" w:pos="5040"/>
+        </w:tabs>
+        <w:ind w:left="5040" w:hanging="360"/>
+      </w:pPr>
+      <w:rPr>
+        <w:rFonts w:ascii="Symbol" w:hAnsi="Symbol" w:hint="default"/>
+        <w:sz w:val="20"/>
+      </w:rPr>
+    </w:lvl>
+    <w:lvl w:ilvl="7" w:tentative="1">
+      <w:start w:val="1"/>
+      <w:numFmt w:val="bullet"/>
+      <w:lvlText w:val=""/>
+      <w:lvlJc w:val="left"/>
+      <w:pPr>
+        <w:tabs>
+          <w:tab w:val="num" w:pos="5760"/>
+        </w:tabs>
+        <w:ind w:left="5760" w:hanging="360"/>
+      </w:pPr>
+      <w:rPr>
+        <w:rFonts w:ascii="Symbol" w:hAnsi="Symbol" w:hint="default"/>
+        <w:sz w:val="20"/>
+      </w:rPr>
+    </w:lvl>
+    <w:lvl w:ilvl="8" w:tentative="1">
+      <w:start w:val="1"/>
+      <w:numFmt w:val="bullet"/>
+      <w:lvlText w:val=""/>
+      <w:lvlJc w:val="left"/>
+      <w:pPr>
+        <w:tabs>
+          <w:tab w:val="num" w:pos="6480"/>
+        </w:tabs>
+        <w:ind w:left="6480" w:hanging="360"/>
+      </w:pPr>
+      <w:rPr>
+        <w:rFonts w:ascii="Symbol" w:hAnsi="Symbol" w:hint="default"/>
+        <w:sz w:val="20"/>
+      </w:rPr>
+    </w:lvl>
+  </w:abstractNum>
   <w:num w:numId="1">
+    <w:abstractNumId w:val="1"/>
+  </w:num>
+  <w:num w:numId="2">
     <w:abstractNumId w:val="0"/>
+  </w:num>
+  <w:num w:numId="3">
+    <w:abstractNumId w:val="4"/>
+  </w:num>
+  <w:num w:numId="4">
+    <w:abstractNumId w:val="5"/>
+  </w:num>
+  <w:num w:numId="5">
+    <w:abstractNumId w:val="3"/>
+  </w:num>
+  <w:num w:numId="6">
+    <w:abstractNumId w:val="2"/>
   </w:num>
 </w:numbering>
 </file>
@@ -1559,7 +3500,6 @@
   <w:style w:type="character" w:default="1" w:styleId="Fuentedeprrafopredeter">
     <w:name w:val="Default Paragraph Font"/>
     <w:uiPriority w:val="1"/>
-    <w:semiHidden/>
     <w:unhideWhenUsed/>
   </w:style>
   <w:style w:type="table" w:default="1" w:styleId="Tablanormal">

</xml_diff>